<commit_message>
Lines added to caption -test of Github connection too.
</commit_message>
<xml_diff>
--- a/template.docx
+++ b/template.docx
@@ -45,6 +45,34 @@
           </w:tcPr>
           <w:p>
             <w:r>
+              <w:t>_____________________________________</w:t>
+            </w:r>
+          </w:p>
+        </w:tc>
+        <w:tc>
+          <w:tcPr>
+            <w:tcW w:w="287" w:type="dxa"/>
+          </w:tcPr>
+          <w:p>
+            <w:pPr>
+              <w:jc w:val="right"/>
+            </w:pPr>
+          </w:p>
+        </w:tc>
+        <w:tc>
+          <w:tcPr>
+            <w:tcW w:w="4312" w:type="dxa"/>
+          </w:tcPr>
+          <w:p/>
+        </w:tc>
+      </w:tr>
+      <w:tr>
+        <w:tc>
+          <w:tcPr>
+            <w:tcW w:w="4320" w:type="dxa"/>
+          </w:tcPr>
+          <w:p>
+            <w:r>
               <w:t>[PLAINTIFF NAME],</w:t>
             </w:r>
           </w:p>
@@ -85,6 +113,9 @@
             <w:tcW w:w="287" w:type="dxa"/>
           </w:tcPr>
           <w:p>
+            <w:pPr>
+              <w:jc w:val="right"/>
+            </w:pPr>
             <w:r>
               <w:t>)</w:t>
             </w:r>
@@ -113,6 +144,9 @@
             <w:tcW w:w="287" w:type="dxa"/>
           </w:tcPr>
           <w:p>
+            <w:pPr>
+              <w:jc w:val="right"/>
+            </w:pPr>
             <w:r>
               <w:t>)</w:t>
             </w:r>
@@ -148,6 +182,9 @@
             <w:tcW w:w="287" w:type="dxa"/>
           </w:tcPr>
           <w:p>
+            <w:pPr>
+              <w:jc w:val="right"/>
+            </w:pPr>
             <w:r>
               <w:t>)</w:t>
             </w:r>
@@ -176,6 +213,9 @@
             <w:tcW w:w="287" w:type="dxa"/>
           </w:tcPr>
           <w:p>
+            <w:pPr>
+              <w:jc w:val="right"/>
+            </w:pPr>
             <w:r>
               <w:t>)</w:t>
             </w:r>
@@ -193,13 +233,20 @@
           <w:tcPr>
             <w:tcW w:w="4320" w:type="dxa"/>
           </w:tcPr>
-          <w:p/>
+          <w:p>
+            <w:r>
+              <w:t>_____________________________________</w:t>
+            </w:r>
+          </w:p>
         </w:tc>
         <w:tc>
           <w:tcPr>
             <w:tcW w:w="287" w:type="dxa"/>
           </w:tcPr>
           <w:p>
+            <w:pPr>
+              <w:jc w:val="right"/>
+            </w:pPr>
             <w:r>
               <w:t>)</w:t>
             </w:r>
@@ -284,10 +331,7 @@
         <w:t>See Mass. Gen. Laws ch. 260, § 2</w:t>
       </w:r>
       <w:r>
-        <w:t>[END IF]</w:t>
-      </w:r>
-      <w:r>
-        <w:t xml:space="preserve">[IF </w:t>
+        <w:t xml:space="preserve">[END IF][IF </w:t>
       </w:r>
       <w:r>
         <w:t>New Hampshire</w:t>

</xml_diff>

<commit_message>
adjusted input document to tie more driectly to field names
</commit_message>
<xml_diff>
--- a/template.docx
+++ b/template.docx
@@ -322,19 +322,46 @@
         <w:t xml:space="preserve">[IF </w:t>
       </w:r>
       <w:r>
+        <w:t>Jurisdiction = “</w:t>
+      </w:r>
+      <w:r>
         <w:t>Massachusetts</w:t>
       </w:r>
       <w:r>
+        <w:t>”</w:t>
+      </w:r>
+      <w:r>
         <w:t>]</w:t>
       </w:r>
       <w:r>
         <w:t>See Mass. Gen. Laws ch. 260, § 2</w:t>
       </w:r>
       <w:r>
-        <w:t xml:space="preserve">[END IF][IF </w:t>
+        <w:t>[END IF][IF</w:t>
+      </w:r>
+      <w:r>
+        <w:t xml:space="preserve"> </w:t>
+      </w:r>
+      <w:r>
+        <w:t>Jurisdiction</w:t>
+      </w:r>
+      <w:r>
+        <w:t xml:space="preserve"> </w:t>
+      </w:r>
+      <w:r>
+        <w:t>=</w:t>
+      </w:r>
+      <w:r>
+        <w:t xml:space="preserve"> </w:t>
+      </w:r>
+      <w:r>
+        <w:t>“</w:t>
       </w:r>
       <w:r>
         <w:t>New Hampshire</w:t>
+      </w:r>
+      <w:r>
+        <w:t>”</w:t>
       </w:r>
       <w:r>
         <w:t>]See N.H. Rev. Stat. Ann. § 508:4.[END IF]</w:t>
@@ -345,7 +372,13 @@
         <w:spacing w:after="240"/>
       </w:pPr>
       <w:r>
-        <w:t>[IF GO CLASS]</w:t>
+        <w:t>[IF GO CLASS</w:t>
+      </w:r>
+      <w:r>
+        <w:t xml:space="preserve"> = “True”</w:t>
+      </w:r>
+      <w:r>
+        <w:t>]</w:t>
       </w:r>
     </w:p>
     <w:p>

</xml_diff>

<commit_message>
Changed field back to type of Habeas Project
</commit_message>
<xml_diff>
--- a/template.docx
+++ b/template.docx
@@ -343,10 +343,7 @@
         <w:t xml:space="preserve"> </w:t>
       </w:r>
       <w:r>
-        <w:t>Jurisdiction</w:t>
-      </w:r>
-      <w:r>
-        <w:t xml:space="preserve"> </w:t>
+        <w:t xml:space="preserve">Jurisdiction </w:t>
       </w:r>
       <w:r>
         <w:t>=</w:t>
@@ -372,10 +369,25 @@
         <w:spacing w:after="240"/>
       </w:pPr>
       <w:r>
-        <w:t>[IF GO CLASS</w:t>
-      </w:r>
-      <w:r>
-        <w:t xml:space="preserve"> = “True”</w:t>
+        <w:t xml:space="preserve">[IF </w:t>
+      </w:r>
+      <w:r>
+        <w:t>Type of Habeas Petition</w:t>
+      </w:r>
+      <w:r>
+        <w:t xml:space="preserve"> = “</w:t>
+      </w:r>
+      <w:r>
+        <w:t>G</w:t>
+      </w:r>
+      <w:r>
+        <w:t>O</w:t>
+      </w:r>
+      <w:r>
+        <w:t xml:space="preserve"> Class</w:t>
+      </w:r>
+      <w:r>
+        <w:t>”</w:t>
       </w:r>
       <w:r>
         <w:t>]</w:t>

</xml_diff>